<commit_message>
Ajustes de Educação Financeira, correções no validador pedagógico e implementação do extrator híbrido
</commit_message>
<xml_diff>
--- a/Auditoria_Estruturas/Auditoria_Sistema_Planos_Luan.docx
+++ b/Auditoria_Estruturas/Auditoria_Sistema_Planos_Luan.docx
@@ -4,15 +4,25 @@
   <w:body>
     <w:p>
       <w:pPr>
-        <w:pStyle w:val="Title"/>
+        <w:jc w:val="center"/>
       </w:pPr>
       <w:r>
-        <w:t>Relatório de Auditoria do Sistema PLANOS_LUAN</w:t>
+        <w:rPr>
+          <w:b/>
+          <w:sz w:val="32"/>
+        </w:rPr>
+        <w:t>Relatorio de Auditoria do Sistema PLANOS_LUAN</w:t>
       </w:r>
     </w:p>
     <w:p>
+      <w:pPr>
+        <w:jc w:val="center"/>
+      </w:pPr>
       <w:r>
-        <w:t>Este documento apresenta uma análise técnica da arquitetura, fluxo de dados e vulnerabilidades críticas do sistema, acompanhada da documentação estrutural solicitada.</w:t>
+        <w:rPr>
+          <w:i/>
+        </w:rPr>
+        <w:t>Fotografia estrutural atualizada em 02/07/2026</w:t>
       </w:r>
     </w:p>
     <w:p>
@@ -20,62 +30,12 @@
         <w:pStyle w:val="Heading1"/>
       </w:pPr>
       <w:r>
-        <w:t>1. Como o Sistema Funciona (Visão Geral)</w:t>
+        <w:t>1. Objetivo deste material</w:t>
       </w:r>
     </w:p>
     <w:p>
       <w:r>
-        <w:t>O sistema é uma pipeline de processamento em lote para geração automática de Planos de Aula no formato Word (.docx). O fluxo é o seguinte:</w:t>
-        <w:br/>
-      </w:r>
-      <w:r>
-        <w:rPr>
-          <w:b/>
-        </w:rPr>
-        <w:t>1. Ingestão (PDFs):</w:t>
-      </w:r>
-      <w:r>
-        <w:t xml:space="preserve"> Lê os PDFs do Google Drive ou pastas locais usando pdfplumber.</w:t>
-        <w:br/>
-      </w:r>
-      <w:r>
-        <w:rPr>
-          <w:b/>
-        </w:rPr>
-        <w:t>2. Normalização e Extração:</w:t>
-      </w:r>
-      <w:r>
-        <w:t xml:space="preserve"> Limpa ruídos do PDF (mojibakes, quebras de linha).</w:t>
-        <w:br/>
-      </w:r>
-      <w:r>
-        <w:rPr>
-          <w:b/>
-        </w:rPr>
-        <w:t>3. Processamento de IA (Gemini):</w:t>
-      </w:r>
-      <w:r>
-        <w:t xml:space="preserve"> Envia o texto para a IA do Google usando Structured Outputs (Pydantic: PlanoAulaIA) garantindo JSON puro.</w:t>
-        <w:br/>
-      </w:r>
-      <w:r>
-        <w:rPr>
-          <w:b/>
-        </w:rPr>
-        <w:t>4. Validação e Qualidade:</w:t>
-      </w:r>
-      <w:r>
-        <w:t xml:space="preserve"> Verifica se o plano bate 80% com o PDF, avalia verbos pedagógicos e checa qualidade da metodologia.</w:t>
-        <w:br/>
-      </w:r>
-      <w:r>
-        <w:rPr>
-          <w:b/>
-        </w:rPr>
-        <w:t>5. Geração Word (.docx):</w:t>
-      </w:r>
-      <w:r>
-        <w:t xml:space="preserve"> Injeta as tags em modelos docx usando python-docx.</w:t>
+        <w:t>Este documento resume o estado atual do sistema PLANOS_LUAN para apoiar uma analise externa mais profunda. O foco aqui nao e reescrever o projeto inteiro, mas identificar por que ele ficou dificil de manter e quais seriam os caminhos mais seguros para estabilizacao gradual.</w:t>
       </w:r>
     </w:p>
     <w:p>
@@ -83,59 +43,12 @@
         <w:pStyle w:val="Heading1"/>
       </w:pPr>
       <w:r>
-        <w:t>2. Auditoria Técnica: Falhas e Perigos (Riscos Críticos)</w:t>
-      </w:r>
-    </w:p>
-    <w:p>
-      <w:pPr>
-        <w:pStyle w:val="Heading2"/>
-      </w:pPr>
-      <w:r>
-        <w:t>Risco 1: "Monolito" do lote.py</w:t>
+        <w:t>2. O que o sistema faz hoje</w:t>
       </w:r>
     </w:p>
     <w:p>
       <w:r>
-        <w:t>O arquivo core/lote.py possui mais de 6000 linhas. Ele concentra a leitura de pastas, chamadas de IA, manipulação de texto e lógicas de retry. Isso cria um gargalo de manutenção gigante. Qualquer alteração nesse arquivo tem alta probabilidade de quebrar o fluxo. Recomendação: Separar a camada de orquestração de pastas da camada de parsing (leitura do PDF).</w:t>
-      </w:r>
-    </w:p>
-    <w:p>
-      <w:pPr>
-        <w:pStyle w:val="Heading2"/>
-      </w:pPr>
-      <w:r>
-        <w:t>Risco 2: Inchaço do Banco de Dados SQLite</w:t>
-      </w:r>
-    </w:p>
-    <w:p>
-      <w:r>
-        <w:t>A tabela historico_planos armazena o binário inteiro do DOCX (coluna arquivo_docx BLOB). Com milhares de planos gerados, o SQLite atingirá vários gigabytes muito rápido, causando lentidão no App Streamlit. Recomendação: Salvar apenas os caminhos dos arquivos gerados e não o binário no banco de dados.</w:t>
-      </w:r>
-    </w:p>
-    <w:p>
-      <w:pPr>
-        <w:pStyle w:val="Heading2"/>
-      </w:pPr>
-      <w:r>
-        <w:t>Risco 3: Cache JSON Estático e "Contaminação"</w:t>
-      </w:r>
-    </w:p>
-    <w:p>
-      <w:r>
-        <w:t>Atualmente o sistema usa arquivos .json ao lado dos PDFs para economizar requisições de IA. Porém, se a estrutura do banco mudar (ex: novas matérias em aulas erradas, como o problema de biologia/português), o sistema lerá o cache eternamente sem saber que ele está contaminado. Nossa implementação de hash sha256 mitigou isso parcialmente, mas requer vigilância caso a IA retorne bobagens pontuais.</w:t>
-      </w:r>
-    </w:p>
-    <w:p>
-      <w:pPr>
-        <w:pStyle w:val="Heading2"/>
-      </w:pPr>
-      <w:r>
-        <w:t>Risco 4: Paralelismo vs Rate Limits do Gemini</w:t>
-      </w:r>
-    </w:p>
-    <w:p>
-      <w:r>
-        <w:t>Ao mandar processar vários PDFs (como vimos com os erros ClientError da API), o rate limit do Google Gemini 2.5 Flash trava a aplicação. Há backoff exponencial no código, mas se o volume de PDFs for de centenas, a API bloqueará a chave temporariamente. Solução: Adotar filas (Celery ou fila simples em SQLite) em background ao invés de barrar o frontend do Streamlit.</w:t>
+        <w:t>O PLANOS_LUAN gera planos de aula em Word a partir de PDFs pedagogicos, referencias metodologicas, modelos de documento e cadastro de professores. O fluxo principal passa por extracao de PDF, heuristicas de leitura, enriquecimento por IA, validacoes internas e preenchimento final do modelo .docx.</w:t>
       </w:r>
     </w:p>
     <w:p>
@@ -143,12 +56,228 @@
         <w:pStyle w:val="Heading1"/>
       </w:pPr>
       <w:r>
-        <w:t>3. Estruturas Extraídas</w:t>
+        <w:t>3. Retrato estrutural atual</w:t>
+      </w:r>
+    </w:p>
+    <w:p>
+      <w:pPr>
+        <w:pStyle w:val="ListBullet"/>
+      </w:pPr>
+      <w:r>
+        <w:t>A pasta raiz mistura codigo-fonte, banco de dados, historico de geracao, documentos Word, referencias pedagogicas e sobras operacionais.</w:t>
+      </w:r>
+    </w:p>
+    <w:p>
+      <w:pPr>
+        <w:pStyle w:val="ListBullet"/>
+      </w:pPr>
+      <w:r>
+        <w:t>Os maiores arquivos centrais concentram muitas responsabilidades, especialmente core/lote.py e planos_luan_app.py.</w:t>
+      </w:r>
+    </w:p>
+    <w:p>
+      <w:pPr>
+        <w:pStyle w:val="ListBullet"/>
+      </w:pPr>
+      <w:r>
+        <w:t>O banco SQLite esta mais leve do que em leituras antigas, porque historico_planos agora salva arquivo_path em vez de BLOB do DOCX.</w:t>
+      </w:r>
+    </w:p>
+    <w:p>
+      <w:pPr>
+        <w:pStyle w:val="ListBullet"/>
+      </w:pPr>
+      <w:r>
+        <w:t>A revisao pos-geracao dos planos esta desabilitada na interface neste momento, mas a logica tecnica de auditoria ainda existe no codigo.</w:t>
+      </w:r>
+    </w:p>
+    <w:p>
+      <w:pPr>
+        <w:pStyle w:val="ListBullet"/>
+      </w:pPr>
+      <w:r>
+        <w:t>O sistema depende bastante de convencoes de pastas e caminhos locais em C:\ e D:\.</w:t>
+      </w:r>
+    </w:p>
+    <w:p>
+      <w:pPr>
+        <w:pStyle w:val="Heading1"/>
+      </w:pPr>
+      <w:r>
+        <w:t>4. Pontos criticos identificados</w:t>
+      </w:r>
+    </w:p>
+    <w:p>
+      <w:pPr>
+        <w:pStyle w:val="ListBullet"/>
+      </w:pPr>
+      <w:r>
+        <w:t>Monolitos de codigo: arquivos grandes demais dificultam previsao de impacto a cada ajuste.</w:t>
+      </w:r>
+    </w:p>
+    <w:p>
+      <w:pPr>
+        <w:pStyle w:val="ListBullet"/>
+      </w:pPr>
+      <w:r>
+        <w:t>Acoplamento alto: interface, regras pedagogicas, validacao e operacao de arquivos estao muito proximas.</w:t>
+      </w:r>
+    </w:p>
+    <w:p>
+      <w:pPr>
+        <w:pStyle w:val="ListBullet"/>
+      </w:pPr>
+      <w:r>
+        <w:t>Mistura entre sistema e operacao: a raiz do projeto tambem virou deposito de historico, laboratorio e evidencias.</w:t>
+      </w:r>
+    </w:p>
+    <w:p>
+      <w:pPr>
+        <w:pStyle w:val="ListBullet"/>
+      </w:pPr>
+      <w:r>
+        <w:t>Contratos parciais: o modelo tipado da IA e pequeno, mas o objeto real do fluxo ganha muitos metadados fora do contrato principal.</w:t>
+      </w:r>
+    </w:p>
+    <w:p>
+      <w:pPr>
+        <w:pStyle w:val="ListBullet"/>
+      </w:pPr>
+      <w:r>
+        <w:t>Dependencia de caminho e estado local: mover arquivos ou pastas manualmente pode alterar o comportamento do sistema.</w:t>
+      </w:r>
+    </w:p>
+    <w:p>
+      <w:pPr>
+        <w:pStyle w:val="Heading1"/>
+      </w:pPr>
+      <w:r>
+        <w:t>5. O que melhorou em relacao a diagnosticos antigos</w:t>
+      </w:r>
+    </w:p>
+    <w:p>
+      <w:pPr>
+        <w:pStyle w:val="ListBullet"/>
+      </w:pPr>
+      <w:r>
+        <w:t>O historico do banco nao guarda mais o binario inteiro do DOCX.</w:t>
+      </w:r>
+    </w:p>
+    <w:p>
+      <w:pPr>
+        <w:pStyle w:val="ListBullet"/>
+      </w:pPr>
+      <w:r>
+        <w:t>A pasta de auditoria agora foi atualizada com schema real, estrutura atual e modelos de dados mais confiaveis.</w:t>
+      </w:r>
+    </w:p>
+    <w:p>
+      <w:pPr>
+        <w:pStyle w:val="ListBullet"/>
+      </w:pPr>
+      <w:r>
+        <w:t>A revisao visual pos-geracao pode ficar fora da operacao por enquanto, reduzindo ruido para testes do fluxo principal.</w:t>
+      </w:r>
+    </w:p>
+    <w:p>
+      <w:pPr>
+        <w:pStyle w:val="Heading1"/>
+      </w:pPr>
+      <w:r>
+        <w:t>6. Prioridades recomendadas para a proxima auditoria</w:t>
+      </w:r>
+    </w:p>
+    <w:p>
+      <w:pPr>
+        <w:pStyle w:val="ListBullet"/>
+      </w:pPr>
+      <w:r>
+        <w:t>Separar claramente codigo, dados operacionais, referencias e area de descarte.</w:t>
+      </w:r>
+    </w:p>
+    <w:p>
+      <w:pPr>
+        <w:pStyle w:val="ListBullet"/>
+      </w:pPr>
+      <w:r>
+        <w:t>Quebrar os arquivos gigantes por responsabilidade, sem reescrever tudo de uma vez.</w:t>
+      </w:r>
+    </w:p>
+    <w:p>
+      <w:pPr>
+        <w:pStyle w:val="ListBullet"/>
+      </w:pPr>
+      <w:r>
+        <w:t>Definir um contrato unico e rastreavel entre extracao, IA, validacao e geracao do DOCX.</w:t>
+      </w:r>
+    </w:p>
+    <w:p>
+      <w:pPr>
+        <w:pStyle w:val="ListBullet"/>
+      </w:pPr>
+      <w:r>
+        <w:t>Revisar o papel de JSON sidecar, DOCX de referencia e caches no comportamento final do sistema.</w:t>
+      </w:r>
+    </w:p>
+    <w:p>
+      <w:pPr>
+        <w:pStyle w:val="ListBullet"/>
+      </w:pPr>
+      <w:r>
+        <w:t>Criar uma estrategia de testes mais objetiva para Windows, incluindo casos reais de PDF e geracao de Word.</w:t>
+      </w:r>
+    </w:p>
+    <w:p>
+      <w:pPr>
+        <w:pStyle w:val="Heading1"/>
+      </w:pPr>
+      <w:r>
+        <w:t>7. Arquivos de apoio incluidos nesta pasta</w:t>
+      </w:r>
+    </w:p>
+    <w:p>
+      <w:pPr>
+        <w:pStyle w:val="ListBullet"/>
+      </w:pPr>
+      <w:r>
+        <w:t>banco_de_dados_schema.txt: schema real do SQLite e observacoes objetivas.</w:t>
+      </w:r>
+    </w:p>
+    <w:p>
+      <w:pPr>
+        <w:pStyle w:val="ListBullet"/>
+      </w:pPr>
+      <w:r>
+        <w:t>estrutura_pastas_projeto.txt: leitura da organizacao atual do projeto e dos pontos de acoplamento.</w:t>
+      </w:r>
+    </w:p>
+    <w:p>
+      <w:pPr>
+        <w:pStyle w:val="ListBullet"/>
+      </w:pPr>
+      <w:r>
+        <w:t>modelos_dados_ia.txt: contrato atual da IA, sidecar JSON e estado da revisao.</w:t>
+      </w:r>
+    </w:p>
+    <w:p>
+      <w:pPr>
+        <w:pStyle w:val="ListBullet"/>
+      </w:pPr>
+      <w:r>
+        <w:t>PROMPT_ANALISE_EXTERNA.md: prompt pronto para enviar a outra ferramenta de analise.</w:t>
+      </w:r>
+    </w:p>
+    <w:p>
+      <w:pPr>
+        <w:pStyle w:val="Heading1"/>
+      </w:pPr>
+      <w:r>
+        <w:t>8. Conclusao</w:t>
       </w:r>
     </w:p>
     <w:p>
       <w:r>
-        <w:t>Todos os arquivos estruturais (banco de dados, pastas, modelos Pydantic) foram extraídos e salvos na pasta: D:\PLANOS_LUAN\Auditoria_Estruturas.</w:t>
+        <w:t>O sistema ainda entrega resultado, mas cresceu por acumulacao. O problema principal nao parece ser uma unica falha isolada; e a soma de arquivos grandes, fronteiras pouco claras e mistura entre desenvolvimento, operacao real e laboratorio manual. A boa noticia e que isso pode ser atacado por fases, com reorganizacao gradual e sem parar completamente o uso do sistema.</w:t>
       </w:r>
     </w:p>
     <w:sectPr>
@@ -524,6 +653,10 @@
     <w:name w:val="Normal"/>
     <w:qFormat/>
     <w:rsid w:val="00FC693F"/>
+    <w:rPr>
+      <w:rFonts w:ascii="Calibri" w:hAnsi="Calibri"/>
+      <w:sz w:val="22"/>
+    </w:rPr>
   </w:style>
   <w:style w:type="paragraph" w:styleId="Header">
     <w:name w:val="header"/>

</xml_diff>